<commit_message>
Added new folders and files for restaurant backend
</commit_message>
<xml_diff>
--- a/DOCS/Business Requirements Document.docx
+++ b/DOCS/Business Requirements Document.docx
@@ -2,6 +2,480 @@
 <file path=word/document.xml><?xml version="1.0" encoding="utf-8"?>
 <w:document xmlns:wpc="http://schemas.microsoft.com/office/word/2010/wordprocessingCanvas" xmlns:cx="http://schemas.microsoft.com/office/drawing/2014/chartex" xmlns:cx1="http://schemas.microsoft.com/office/drawing/2015/9/8/chartex" xmlns:cx2="http://schemas.microsoft.com/office/drawing/2015/10/21/chartex" xmlns:cx3="http://schemas.microsoft.com/office/drawing/2016/5/9/chartex" xmlns:cx4="http://schemas.microsoft.com/office/drawing/2016/5/10/chartex" xmlns:cx5="http://schemas.microsoft.com/office/drawing/2016/5/11/chartex" xmlns:cx6="http://schemas.microsoft.com/office/drawing/2016/5/12/chartex" xmlns:cx7="http://schemas.microsoft.com/office/drawing/2016/5/13/chartex" xmlns:cx8="http://schemas.microsoft.com/office/drawing/2016/5/14/chartex" xmlns:mc="http://schemas.openxmlformats.org/markup-compatibility/2006" xmlns:aink="http://schemas.microsoft.com/office/drawing/2016/ink" xmlns:am3d="http://schemas.microsoft.com/office/drawing/2017/model3d" xmlns:o="urn:schemas-microsoft-com:office:office" xmlns:oel="http://schemas.microsoft.com/office/2019/extlst" xmlns:r="http://schemas.openxmlformats.org/officeDocument/2006/relationships" xmlns:m="http://schemas.openxmlformats.org/officeDocument/2006/math" xmlns:v="urn:schemas-microsoft-com:vml" xmlns:wp14="http://schemas.microsoft.com/office/word/2010/wordprocessingDrawing" xmlns:wp="http://schemas.openxmlformats.org/drawingml/2006/wordprocessingDrawing" xmlns:w10="urn:schemas-microsoft-com:office:word" xmlns:w="http://schemas.openxmlformats.org/wordprocessingml/2006/main" xmlns:w14="http://schemas.microsoft.com/office/word/2010/wordml" xmlns:w15="http://schemas.microsoft.com/office/word/2012/wordml" xmlns:w16cei="http://schemas.microsoft.com/office/word/2026/wordml/cei" xmlns:w16cex="http://schemas.microsoft.com/office/word/2018/wordml/cex" xmlns:w16cid="http://schemas.microsoft.com/office/word/2016/wordml/cid" xmlns:w16="http://schemas.microsoft.com/office/word/2018/wordml" xmlns:w16du="http://schemas.microsoft.com/office/word/2023/wordml/word16du" xmlns:w16sdtdh="http://schemas.microsoft.com/office/word/2020/wordml/sdtdatahash" xmlns:w16sdtfl="http://schemas.microsoft.com/office/word/2024/wordml/sdtformatlock" xmlns:w16se="http://schemas.microsoft.com/office/word/2015/wordml/symex" xmlns:wpg="http://schemas.microsoft.com/office/word/2010/wordprocessingGroup" xmlns:wpi="http://schemas.microsoft.com/office/word/2010/wordprocessingInk" xmlns:wne="http://schemas.microsoft.com/office/word/2006/wordml" xmlns:wps="http://schemas.microsoft.com/office/word/2010/wordprocessingShape" mc:Ignorable="w14 w15 w16se w16cid w16 w16cex w16sdtdh w16sdtfl w16du wp14">
   <w:body>
+    <w:p>
+      <w:pPr>
+        <w:numPr>
+          <w:ilvl w:val="0"/>
+          <w:numId w:val="26"/>
+        </w:numPr>
+        <w:rPr>
+          <w:b/>
+          <w:bCs/>
+        </w:rPr>
+      </w:pPr>
+      <w:r>
+        <w:rPr>
+          <w:rFonts w:ascii="Segoe UI Emoji" w:hAnsi="Segoe UI Emoji" w:cs="Segoe UI Emoji"/>
+          <w:b/>
+          <w:bCs/>
+        </w:rPr>
+        <w:t>✅</w:t>
+      </w:r>
+      <w:r>
+        <w:rPr>
+          <w:b/>
+          <w:bCs/>
+        </w:rPr>
+        <w:t xml:space="preserve"> Authentication &amp; role-based authorization </w:t>
+      </w:r>
+    </w:p>
+    <w:p>
+      <w:pPr>
+        <w:numPr>
+          <w:ilvl w:val="0"/>
+          <w:numId w:val="26"/>
+        </w:numPr>
+        <w:rPr>
+          <w:b/>
+          <w:bCs/>
+        </w:rPr>
+      </w:pPr>
+      <w:r>
+        <w:rPr>
+          <w:rFonts w:ascii="Segoe UI Emoji" w:hAnsi="Segoe UI Emoji" w:cs="Segoe UI Emoji"/>
+          <w:b/>
+          <w:bCs/>
+        </w:rPr>
+        <w:t>✅</w:t>
+      </w:r>
+      <w:r>
+        <w:rPr>
+          <w:b/>
+          <w:bCs/>
+        </w:rPr>
+        <w:t xml:space="preserve"> CRUD for Users, Menu Categories, Menu Items </w:t>
+      </w:r>
+    </w:p>
+    <w:p>
+      <w:pPr>
+        <w:numPr>
+          <w:ilvl w:val="0"/>
+          <w:numId w:val="26"/>
+        </w:numPr>
+        <w:rPr>
+          <w:b/>
+          <w:bCs/>
+        </w:rPr>
+      </w:pPr>
+      <w:r>
+        <w:rPr>
+          <w:rFonts w:ascii="Segoe UI Emoji" w:hAnsi="Segoe UI Emoji" w:cs="Segoe UI Emoji"/>
+          <w:b/>
+          <w:bCs/>
+        </w:rPr>
+        <w:t>✅</w:t>
+      </w:r>
+      <w:r>
+        <w:rPr>
+          <w:b/>
+          <w:bCs/>
+        </w:rPr>
+        <w:t xml:space="preserve"> Cart </w:t>
+      </w:r>
+    </w:p>
+    <w:p>
+      <w:pPr>
+        <w:numPr>
+          <w:ilvl w:val="0"/>
+          <w:numId w:val="26"/>
+        </w:numPr>
+        <w:rPr>
+          <w:b/>
+          <w:bCs/>
+        </w:rPr>
+      </w:pPr>
+      <w:r>
+        <w:rPr>
+          <w:rFonts w:ascii="Segoe UI Emoji" w:hAnsi="Segoe UI Emoji" w:cs="Segoe UI Emoji"/>
+          <w:b/>
+          <w:bCs/>
+        </w:rPr>
+        <w:t>✅</w:t>
+      </w:r>
+      <w:r>
+        <w:rPr>
+          <w:b/>
+          <w:bCs/>
+        </w:rPr>
+        <w:t xml:space="preserve"> Place Order </w:t>
+      </w:r>
+    </w:p>
+    <w:p>
+      <w:pPr>
+        <w:numPr>
+          <w:ilvl w:val="0"/>
+          <w:numId w:val="26"/>
+        </w:numPr>
+        <w:rPr>
+          <w:b/>
+          <w:bCs/>
+        </w:rPr>
+      </w:pPr>
+      <w:r>
+        <w:rPr>
+          <w:rFonts w:ascii="Segoe UI Emoji" w:hAnsi="Segoe UI Emoji" w:cs="Segoe UI Emoji"/>
+          <w:b/>
+          <w:bCs/>
+        </w:rPr>
+        <w:t>✅</w:t>
+      </w:r>
+      <w:r>
+        <w:rPr>
+          <w:b/>
+          <w:bCs/>
+        </w:rPr>
+        <w:t xml:space="preserve"> Reservation </w:t>
+      </w:r>
+    </w:p>
+    <w:p>
+      <w:pPr>
+        <w:numPr>
+          <w:ilvl w:val="0"/>
+          <w:numId w:val="26"/>
+        </w:numPr>
+        <w:rPr>
+          <w:b/>
+          <w:bCs/>
+        </w:rPr>
+      </w:pPr>
+      <w:r>
+        <w:rPr>
+          <w:rFonts w:ascii="Segoe UI Emoji" w:hAnsi="Segoe UI Emoji" w:cs="Segoe UI Emoji"/>
+          <w:b/>
+          <w:bCs/>
+        </w:rPr>
+        <w:t>✅</w:t>
+      </w:r>
+      <w:r>
+        <w:rPr>
+          <w:b/>
+          <w:bCs/>
+        </w:rPr>
+        <w:t xml:space="preserve"> Reviews </w:t>
+      </w:r>
+    </w:p>
+    <w:p>
+      <w:pPr>
+        <w:numPr>
+          <w:ilvl w:val="0"/>
+          <w:numId w:val="26"/>
+        </w:numPr>
+        <w:rPr>
+          <w:b/>
+          <w:bCs/>
+        </w:rPr>
+      </w:pPr>
+      <w:r>
+        <w:rPr>
+          <w:rFonts w:ascii="Segoe UI Emoji" w:hAnsi="Segoe UI Emoji" w:cs="Segoe UI Emoji"/>
+          <w:b/>
+          <w:bCs/>
+        </w:rPr>
+        <w:t>✅</w:t>
+      </w:r>
+      <w:r>
+        <w:rPr>
+          <w:b/>
+          <w:bCs/>
+        </w:rPr>
+        <w:t xml:space="preserve"> Payment (can be mocked) </w:t>
+      </w:r>
+    </w:p>
+    <w:p>
+      <w:pPr>
+        <w:numPr>
+          <w:ilvl w:val="0"/>
+          <w:numId w:val="26"/>
+        </w:numPr>
+        <w:rPr>
+          <w:b/>
+          <w:bCs/>
+        </w:rPr>
+      </w:pPr>
+      <w:r>
+        <w:rPr>
+          <w:rFonts w:ascii="Segoe UI Emoji" w:hAnsi="Segoe UI Emoji" w:cs="Segoe UI Emoji"/>
+          <w:b/>
+          <w:bCs/>
+        </w:rPr>
+        <w:t>✅</w:t>
+      </w:r>
+      <w:r>
+        <w:rPr>
+          <w:b/>
+          <w:bCs/>
+        </w:rPr>
+        <w:t xml:space="preserve"> Search </w:t>
+      </w:r>
+    </w:p>
+    <w:p>
+      <w:pPr>
+        <w:numPr>
+          <w:ilvl w:val="0"/>
+          <w:numId w:val="26"/>
+        </w:numPr>
+        <w:rPr>
+          <w:b/>
+          <w:bCs/>
+        </w:rPr>
+      </w:pPr>
+      <w:r>
+        <w:rPr>
+          <w:rFonts w:ascii="Segoe UI Emoji" w:hAnsi="Segoe UI Emoji" w:cs="Segoe UI Emoji"/>
+          <w:b/>
+          <w:bCs/>
+        </w:rPr>
+        <w:t>✅</w:t>
+      </w:r>
+      <w:r>
+        <w:rPr>
+          <w:b/>
+          <w:bCs/>
+        </w:rPr>
+        <w:t xml:space="preserve"> Pagination </w:t>
+      </w:r>
+    </w:p>
+    <w:p>
+      <w:pPr>
+        <w:numPr>
+          <w:ilvl w:val="0"/>
+          <w:numId w:val="26"/>
+        </w:numPr>
+        <w:rPr>
+          <w:b/>
+          <w:bCs/>
+        </w:rPr>
+      </w:pPr>
+      <w:r>
+        <w:rPr>
+          <w:rFonts w:ascii="Segoe UI Emoji" w:hAnsi="Segoe UI Emoji" w:cs="Segoe UI Emoji"/>
+          <w:b/>
+          <w:bCs/>
+        </w:rPr>
+        <w:t>✅</w:t>
+      </w:r>
+      <w:r>
+        <w:rPr>
+          <w:b/>
+          <w:bCs/>
+        </w:rPr>
+        <w:t xml:space="preserve"> Sorting </w:t>
+      </w:r>
+    </w:p>
+    <w:p>
+      <w:pPr>
+        <w:numPr>
+          <w:ilvl w:val="0"/>
+          <w:numId w:val="26"/>
+        </w:numPr>
+        <w:rPr>
+          <w:b/>
+          <w:bCs/>
+        </w:rPr>
+      </w:pPr>
+      <w:r>
+        <w:rPr>
+          <w:rFonts w:ascii="Segoe UI Emoji" w:hAnsi="Segoe UI Emoji" w:cs="Segoe UI Emoji"/>
+          <w:b/>
+          <w:bCs/>
+        </w:rPr>
+        <w:t>✅</w:t>
+      </w:r>
+      <w:r>
+        <w:rPr>
+          <w:b/>
+          <w:bCs/>
+        </w:rPr>
+        <w:t xml:space="preserve"> Validation </w:t>
+      </w:r>
+    </w:p>
+    <w:p>
+      <w:pPr>
+        <w:numPr>
+          <w:ilvl w:val="0"/>
+          <w:numId w:val="26"/>
+        </w:numPr>
+        <w:rPr>
+          <w:b/>
+          <w:bCs/>
+        </w:rPr>
+      </w:pPr>
+      <w:r>
+        <w:rPr>
+          <w:rFonts w:ascii="Segoe UI Emoji" w:hAnsi="Segoe UI Emoji" w:cs="Segoe UI Emoji"/>
+          <w:b/>
+          <w:bCs/>
+        </w:rPr>
+        <w:t>✅</w:t>
+      </w:r>
+      <w:r>
+        <w:rPr>
+          <w:b/>
+          <w:bCs/>
+        </w:rPr>
+        <w:t xml:space="preserve"> Global exception handling </w:t>
+      </w:r>
+    </w:p>
+    <w:p>
+      <w:pPr>
+        <w:numPr>
+          <w:ilvl w:val="0"/>
+          <w:numId w:val="26"/>
+        </w:numPr>
+        <w:rPr>
+          <w:b/>
+          <w:bCs/>
+        </w:rPr>
+      </w:pPr>
+      <w:r>
+        <w:rPr>
+          <w:rFonts w:ascii="Segoe UI Emoji" w:hAnsi="Segoe UI Emoji" w:cs="Segoe UI Emoji"/>
+          <w:b/>
+          <w:bCs/>
+        </w:rPr>
+        <w:t>✅</w:t>
+      </w:r>
+      <w:r>
+        <w:rPr>
+          <w:b/>
+          <w:bCs/>
+        </w:rPr>
+        <w:t xml:space="preserve"> Unit tests </w:t>
+      </w:r>
+    </w:p>
+    <w:p>
+      <w:pPr>
+        <w:rPr>
+          <w:b/>
+          <w:bCs/>
+        </w:rPr>
+      </w:pPr>
+      <w:r>
+        <w:rPr>
+          <w:b/>
+          <w:bCs/>
+        </w:rPr>
+        <w:t>Business Rules</w:t>
+      </w:r>
+    </w:p>
+    <w:p>
+      <w:pPr>
+        <w:numPr>
+          <w:ilvl w:val="0"/>
+          <w:numId w:val="27"/>
+        </w:numPr>
+        <w:rPr>
+          <w:b/>
+          <w:bCs/>
+        </w:rPr>
+      </w:pPr>
+      <w:r>
+        <w:rPr>
+          <w:rFonts w:ascii="Segoe UI Emoji" w:hAnsi="Segoe UI Emoji" w:cs="Segoe UI Emoji"/>
+          <w:b/>
+          <w:bCs/>
+        </w:rPr>
+        <w:t>✅</w:t>
+      </w:r>
+      <w:r>
+        <w:rPr>
+          <w:b/>
+          <w:bCs/>
+        </w:rPr>
+        <w:t xml:space="preserve"> Prevent double-booking of tables </w:t>
+      </w:r>
+    </w:p>
+    <w:p>
+      <w:pPr>
+        <w:numPr>
+          <w:ilvl w:val="0"/>
+          <w:numId w:val="27"/>
+        </w:numPr>
+        <w:rPr>
+          <w:b/>
+          <w:bCs/>
+        </w:rPr>
+      </w:pPr>
+      <w:r>
+        <w:rPr>
+          <w:rFonts w:ascii="Segoe UI Emoji" w:hAnsi="Segoe UI Emoji" w:cs="Segoe UI Emoji"/>
+          <w:b/>
+          <w:bCs/>
+        </w:rPr>
+        <w:t>✅</w:t>
+      </w:r>
+      <w:r>
+        <w:rPr>
+          <w:b/>
+          <w:bCs/>
+        </w:rPr>
+        <w:t xml:space="preserve"> Prevent ordering unavailable items </w:t>
+      </w:r>
+    </w:p>
+    <w:p>
+      <w:pPr>
+        <w:numPr>
+          <w:ilvl w:val="0"/>
+          <w:numId w:val="27"/>
+        </w:numPr>
+        <w:rPr>
+          <w:b/>
+          <w:bCs/>
+        </w:rPr>
+      </w:pPr>
+      <w:r>
+        <w:rPr>
+          <w:rFonts w:ascii="Segoe UI Emoji" w:hAnsi="Segoe UI Emoji" w:cs="Segoe UI Emoji"/>
+          <w:b/>
+          <w:bCs/>
+        </w:rPr>
+        <w:t>✅</w:t>
+      </w:r>
+      <w:r>
+        <w:rPr>
+          <w:b/>
+          <w:bCs/>
+        </w:rPr>
+        <w:t xml:space="preserve"> Only allow purchased items to be reviewed </w:t>
+      </w:r>
+    </w:p>
+    <w:p>
+      <w:pPr>
+        <w:numPr>
+          <w:ilvl w:val="0"/>
+          <w:numId w:val="27"/>
+        </w:numPr>
+        <w:rPr>
+          <w:b/>
+          <w:bCs/>
+        </w:rPr>
+      </w:pPr>
+      <w:r>
+        <w:rPr>
+          <w:rFonts w:ascii="Segoe UI Emoji" w:hAnsi="Segoe UI Emoji" w:cs="Segoe UI Emoji"/>
+          <w:b/>
+          <w:bCs/>
+        </w:rPr>
+        <w:t>✅</w:t>
+      </w:r>
+      <w:r>
+        <w:rPr>
+          <w:b/>
+          <w:bCs/>
+        </w:rPr>
+        <w:t xml:space="preserve"> Order status workflow</w:t>
+      </w:r>
+    </w:p>
     <w:p>
       <w:pPr>
         <w:rPr>
@@ -276,7 +750,39 @@
           <w:b/>
           <w:bCs/>
         </w:rPr>
-        <w:t>This document defines the business and functional requirements for a full-stack restaurant web application. The platform allows customers to browse a restaurant's menu, reserve a table, place food orders, pay for those orders, and leave reviews. Restaurant administrators manage the menu catalog, table reservations, order fulfillment status, and review moderation.</w:t>
+        <w:t xml:space="preserve">This document defines the business and functional requirements for a full-stack restaurant web application. The platform allows customers to browse a restaurant's menu, reserve a table, place food orders, pay for those orders, and leave reviews. Restaurant administrators manage the menu </w:t>
+      </w:r>
+      <w:proofErr w:type="spellStart"/>
+      <w:r>
+        <w:rPr>
+          <w:b/>
+          <w:bCs/>
+        </w:rPr>
+        <w:t>catalog</w:t>
+      </w:r>
+      <w:proofErr w:type="spellEnd"/>
+      <w:r>
+        <w:rPr>
+          <w:b/>
+          <w:bCs/>
+        </w:rPr>
+        <w:t xml:space="preserve">, table reservations, order </w:t>
+      </w:r>
+      <w:proofErr w:type="spellStart"/>
+      <w:r>
+        <w:rPr>
+          <w:b/>
+          <w:bCs/>
+        </w:rPr>
+        <w:t>fulfillment</w:t>
+      </w:r>
+      <w:proofErr w:type="spellEnd"/>
+      <w:r>
+        <w:rPr>
+          <w:b/>
+          <w:bCs/>
+        </w:rPr>
+        <w:t xml:space="preserve"> status, and review moderation.</w:t>
       </w:r>
     </w:p>
     <w:p>
@@ -306,6 +812,7 @@
           <w:b/>
           <w:bCs/>
         </w:rPr>
+        <w:lastRenderedPageBreak/>
         <w:t>Develop a full-stack restaurant web application where customers can browse the menu, reserve tables, order food online, make payments, and provide reviews — while administrators manage menu items, reservations, and customer orders through the same platform.</w:t>
       </w:r>
     </w:p>
@@ -412,7 +919,23 @@
           <w:b/>
           <w:bCs/>
         </w:rPr>
-        <w:t>Admin-managed menu catalog (CRUD + availability toggling)</w:t>
+        <w:t xml:space="preserve">Admin-managed menu </w:t>
+      </w:r>
+      <w:proofErr w:type="spellStart"/>
+      <w:r>
+        <w:rPr>
+          <w:b/>
+          <w:bCs/>
+        </w:rPr>
+        <w:t>catalog</w:t>
+      </w:r>
+      <w:proofErr w:type="spellEnd"/>
+      <w:r>
+        <w:rPr>
+          <w:b/>
+          <w:bCs/>
+        </w:rPr>
+        <w:t xml:space="preserve"> (CRUD + availability toggling)</w:t>
       </w:r>
     </w:p>
     <w:p>
@@ -684,7 +1207,23 @@
                 <w:b/>
                 <w:bCs/>
               </w:rPr>
-              <w:t>Restaurant staff/owner who manages menu content, reservations, order fulfillment, and review moderation.</w:t>
+              <w:t xml:space="preserve">Restaurant staff/owner who manages menu content, reservations, order </w:t>
+            </w:r>
+            <w:proofErr w:type="spellStart"/>
+            <w:r>
+              <w:rPr>
+                <w:b/>
+                <w:bCs/>
+              </w:rPr>
+              <w:t>fulfillment</w:t>
+            </w:r>
+            <w:proofErr w:type="spellEnd"/>
+            <w:r>
+              <w:rPr>
+                <w:b/>
+                <w:bCs/>
+              </w:rPr>
+              <w:t>, and review moderation.</w:t>
             </w:r>
           </w:p>
         </w:tc>
@@ -702,7 +1241,6 @@
           <w:b/>
           <w:bCs/>
         </w:rPr>
-        <w:lastRenderedPageBreak/>
         <w:t>5. Assumptions &amp; Constraints</w:t>
       </w:r>
     </w:p>
@@ -760,7 +1298,23 @@
           <w:b/>
           <w:bCs/>
         </w:rPr>
-        <w:t>Table capacity is modeled as a maximum number of reservations permitted per time slot, not as individually numbered physical tables (see US-7).</w:t>
+        <w:t xml:space="preserve">Table capacity is </w:t>
+      </w:r>
+      <w:proofErr w:type="spellStart"/>
+      <w:r>
+        <w:rPr>
+          <w:b/>
+          <w:bCs/>
+        </w:rPr>
+        <w:t>modeled</w:t>
+      </w:r>
+      <w:proofErr w:type="spellEnd"/>
+      <w:r>
+        <w:rPr>
+          <w:b/>
+          <w:bCs/>
+        </w:rPr>
+        <w:t xml:space="preserve"> as a maximum number of reservations permitted per time slot, not as individually numbered physical tables (see US-7).</w:t>
       </w:r>
     </w:p>
     <w:p>
@@ -798,7 +1352,23 @@
           <w:b/>
           <w:bCs/>
         </w:rPr>
-        <w:t>All timestamps are assumed to be in a single system-wide timezone.</w:t>
+        <w:t xml:space="preserve">All timestamps are assumed to be in a single system-wide </w:t>
+      </w:r>
+      <w:proofErr w:type="spellStart"/>
+      <w:r>
+        <w:rPr>
+          <w:b/>
+          <w:bCs/>
+        </w:rPr>
+        <w:t>timezone</w:t>
+      </w:r>
+      <w:proofErr w:type="spellEnd"/>
+      <w:r>
+        <w:rPr>
+          <w:b/>
+          <w:bCs/>
+        </w:rPr>
+        <w:t>.</w:t>
       </w:r>
     </w:p>
     <w:p>
@@ -828,7 +1398,23 @@
           <w:b/>
           <w:bCs/>
         </w:rPr>
-        <w:t>Each user story below is tagged with a priority using MoSCoW prioritization (Must, Should, Could) and the primary data entities it touches.</w:t>
+        <w:t xml:space="preserve">Each user story below is tagged with a priority using </w:t>
+      </w:r>
+      <w:proofErr w:type="spellStart"/>
+      <w:r>
+        <w:rPr>
+          <w:b/>
+          <w:bCs/>
+        </w:rPr>
+        <w:t>MoSCoW</w:t>
+      </w:r>
+      <w:proofErr w:type="spellEnd"/>
+      <w:r>
+        <w:rPr>
+          <w:b/>
+          <w:bCs/>
+        </w:rPr>
+        <w:t xml:space="preserve"> prioritization (Must, Should, Could) and the primary data entities it touches.</w:t>
       </w:r>
     </w:p>
     <w:p>
@@ -875,6 +1461,7 @@
           <w:b/>
           <w:bCs/>
         </w:rPr>
+        <w:lastRenderedPageBreak/>
         <w:t>Priority: Must Have | Entities: User, Role</w:t>
       </w:r>
     </w:p>
@@ -971,7 +1558,23 @@
           <w:b/>
           <w:bCs/>
         </w:rPr>
-        <w:t>Password is hashed (BCrypt) before persistence — plaintext passwords are never stored.</w:t>
+        <w:t>Password is hashed (</w:t>
+      </w:r>
+      <w:proofErr w:type="spellStart"/>
+      <w:r>
+        <w:rPr>
+          <w:b/>
+          <w:bCs/>
+        </w:rPr>
+        <w:t>BCrypt</w:t>
+      </w:r>
+      <w:proofErr w:type="spellEnd"/>
+      <w:r>
+        <w:rPr>
+          <w:b/>
+          <w:bCs/>
+        </w:rPr>
+        <w:t>) before persistence — plaintext passwords are never stored.</w:t>
       </w:r>
     </w:p>
     <w:p>
@@ -1182,7 +1785,6 @@
           <w:b/>
           <w:bCs/>
         </w:rPr>
-        <w:lastRenderedPageBreak/>
         <w:t>Requests to admin endpoints from an authenticated user without the ADMIN role return 403 Forbidden.</w:t>
       </w:r>
     </w:p>
@@ -1249,8 +1851,33 @@
           <w:b/>
           <w:bCs/>
         </w:rPr>
-        <w:t>Priority: Must Have | Entities: MenuItem, MenuCategory</w:t>
-      </w:r>
+        <w:t xml:space="preserve">Priority: Must Have | Entities: </w:t>
+      </w:r>
+      <w:proofErr w:type="spellStart"/>
+      <w:r>
+        <w:rPr>
+          <w:b/>
+          <w:bCs/>
+        </w:rPr>
+        <w:t>MenuItem</w:t>
+      </w:r>
+      <w:proofErr w:type="spellEnd"/>
+      <w:r>
+        <w:rPr>
+          <w:b/>
+          <w:bCs/>
+        </w:rPr>
+        <w:t xml:space="preserve">, </w:t>
+      </w:r>
+      <w:proofErr w:type="spellStart"/>
+      <w:r>
+        <w:rPr>
+          <w:b/>
+          <w:bCs/>
+        </w:rPr>
+        <w:t>MenuCategory</w:t>
+      </w:r>
+      <w:proofErr w:type="spellEnd"/>
     </w:p>
     <w:p>
       <w:pPr>
@@ -1379,6 +2006,7 @@
           <w:b/>
           <w:bCs/>
         </w:rPr>
+        <w:lastRenderedPageBreak/>
         <w:t xml:space="preserve">US-5 — Manage Menu Items (Admin) </w:t>
       </w:r>
       <w:r>
@@ -1699,7 +2327,6 @@
           <w:b/>
           <w:bCs/>
         </w:rPr>
-        <w:lastRenderedPageBreak/>
         <w:t>If a new reservation request would exceed the configured capacity for that date/time slot, the request is rejected.</w:t>
       </w:r>
     </w:p>
@@ -1864,6 +2491,7 @@
           <w:b/>
           <w:bCs/>
         </w:rPr>
+        <w:lastRenderedPageBreak/>
         <w:pict w14:anchorId="1AB92CB3">
           <v:rect id="_x0000_i1029" style="width:0;height:1.5pt" o:hralign="center" o:hrstd="t" o:hr="t" fillcolor="#a0a0a0" stroked="f"/>
         </w:pict>
@@ -1896,8 +2524,33 @@
           <w:b/>
           <w:bCs/>
         </w:rPr>
-        <w:t>Priority: Must Have | Entities: Cart, CartItem, Order, OrderItem</w:t>
-      </w:r>
+        <w:t xml:space="preserve">Priority: Must Have | Entities: Cart, </w:t>
+      </w:r>
+      <w:proofErr w:type="spellStart"/>
+      <w:r>
+        <w:rPr>
+          <w:b/>
+          <w:bCs/>
+        </w:rPr>
+        <w:t>CartItem</w:t>
+      </w:r>
+      <w:proofErr w:type="spellEnd"/>
+      <w:r>
+        <w:rPr>
+          <w:b/>
+          <w:bCs/>
+        </w:rPr>
+        <w:t xml:space="preserve">, Order, </w:t>
+      </w:r>
+      <w:proofErr w:type="spellStart"/>
+      <w:r>
+        <w:rPr>
+          <w:b/>
+          <w:bCs/>
+        </w:rPr>
+        <w:t>OrderItem</w:t>
+      </w:r>
+      <w:proofErr w:type="spellEnd"/>
     </w:p>
     <w:p>
       <w:pPr>
@@ -2069,7 +2722,23 @@
           <w:b/>
           <w:bCs/>
         </w:rPr>
-        <w:t>Customer selects a fulfillment method: delivery or pickup.</w:t>
+        <w:t xml:space="preserve">Customer selects a </w:t>
+      </w:r>
+      <w:proofErr w:type="spellStart"/>
+      <w:r>
+        <w:rPr>
+          <w:b/>
+          <w:bCs/>
+        </w:rPr>
+        <w:t>fulfillment</w:t>
+      </w:r>
+      <w:proofErr w:type="spellEnd"/>
+      <w:r>
+        <w:rPr>
+          <w:b/>
+          <w:bCs/>
+        </w:rPr>
+        <w:t xml:space="preserve"> method: delivery or pickup.</w:t>
       </w:r>
     </w:p>
     <w:p>
@@ -2088,7 +2757,23 @@
           <w:b/>
           <w:bCs/>
         </w:rPr>
-        <w:t>On confirmation, the system creates an Order record and corresponding OrderItem records within a single transaction.</w:t>
+        <w:t xml:space="preserve">On confirmation, the system creates an Order record and corresponding </w:t>
+      </w:r>
+      <w:proofErr w:type="spellStart"/>
+      <w:r>
+        <w:rPr>
+          <w:b/>
+          <w:bCs/>
+        </w:rPr>
+        <w:t>OrderItem</w:t>
+      </w:r>
+      <w:proofErr w:type="spellEnd"/>
+      <w:r>
+        <w:rPr>
+          <w:b/>
+          <w:bCs/>
+        </w:rPr>
+        <w:t xml:space="preserve"> records within a single transaction.</w:t>
       </w:r>
     </w:p>
     <w:p>
@@ -2180,7 +2865,6 @@
           <w:b/>
           <w:bCs/>
         </w:rPr>
-        <w:lastRenderedPageBreak/>
         <w:t xml:space="preserve">US-12 — Update Order Status (Admin) </w:t>
       </w:r>
       <w:r>
@@ -2190,7 +2874,27 @@
           <w:i/>
           <w:iCs/>
         </w:rPr>
-        <w:t>As an admin, I want to update the status of an order as it moves through fulfillment.</w:t>
+        <w:t xml:space="preserve">As an admin, I want to update the status of an order as it moves through </w:t>
+      </w:r>
+      <w:proofErr w:type="spellStart"/>
+      <w:r>
+        <w:rPr>
+          <w:b/>
+          <w:bCs/>
+          <w:i/>
+          <w:iCs/>
+        </w:rPr>
+        <w:t>fulfillment</w:t>
+      </w:r>
+      <w:proofErr w:type="spellEnd"/>
+      <w:r>
+        <w:rPr>
+          <w:b/>
+          <w:bCs/>
+          <w:i/>
+          <w:iCs/>
+        </w:rPr>
+        <w:t>.</w:t>
       </w:r>
     </w:p>
     <w:p>
@@ -2367,6 +3071,7 @@
           <w:b/>
           <w:bCs/>
         </w:rPr>
+        <w:lastRenderedPageBreak/>
         <w:t xml:space="preserve">A customer may submit at most one review per completed order. </w:t>
       </w:r>
       <w:r>
@@ -2692,7 +3397,6 @@
           <w:b/>
           <w:bCs/>
         </w:rPr>
-        <w:lastRenderedPageBreak/>
         <w:t>On success: a Payment record is created, the associated order's status is updated to PAID, and a receipt is generated for the customer.</w:t>
       </w:r>
     </w:p>
@@ -2816,7 +3520,23 @@
           <w:b/>
           <w:bCs/>
         </w:rPr>
-        <w:t>Passwords are hashed using BCrypt; plaintext passwords are never logged or stored.</w:t>
+        <w:t xml:space="preserve">Passwords are hashed using </w:t>
+      </w:r>
+      <w:proofErr w:type="spellStart"/>
+      <w:r>
+        <w:rPr>
+          <w:b/>
+          <w:bCs/>
+        </w:rPr>
+        <w:t>BCrypt</w:t>
+      </w:r>
+      <w:proofErr w:type="spellEnd"/>
+      <w:r>
+        <w:rPr>
+          <w:b/>
+          <w:bCs/>
+        </w:rPr>
+        <w:t>; plaintext passwords are never logged or stored.</w:t>
       </w:r>
     </w:p>
     <w:p>
@@ -2869,6 +3589,7 @@
           <w:b/>
           <w:bCs/>
         </w:rPr>
+        <w:lastRenderedPageBreak/>
         <w:t>7.2 Performance</w:t>
       </w:r>
     </w:p>
@@ -3246,14 +3967,15 @@
                 <w:bCs/>
               </w:rPr>
             </w:pPr>
+            <w:proofErr w:type="spellStart"/>
             <w:r>
               <w:rPr>
                 <w:b/>
                 <w:bCs/>
               </w:rPr>
-              <w:lastRenderedPageBreak/>
               <w:t>MenuCategory</w:t>
             </w:r>
+            <w:proofErr w:type="spellEnd"/>
           </w:p>
         </w:tc>
         <w:tc>
@@ -3296,6 +4018,7 @@
                 <w:bCs/>
               </w:rPr>
             </w:pPr>
+            <w:proofErr w:type="spellStart"/>
             <w:r>
               <w:rPr>
                 <w:b/>
@@ -3303,6 +4026,7 @@
               </w:rPr>
               <w:t>MenuItem</w:t>
             </w:r>
+            <w:proofErr w:type="spellEnd"/>
           </w:p>
         </w:tc>
         <w:tc>
@@ -3399,8 +4123,17 @@
                 <w:b/>
                 <w:bCs/>
               </w:rPr>
-              <w:t>Cart / CartItem</w:t>
+              <w:t xml:space="preserve">Cart / </w:t>
             </w:r>
+            <w:proofErr w:type="spellStart"/>
+            <w:r>
+              <w:rPr>
+                <w:b/>
+                <w:bCs/>
+              </w:rPr>
+              <w:t>CartItem</w:t>
+            </w:r>
+            <w:proofErr w:type="spellEnd"/>
           </w:p>
         </w:tc>
         <w:tc>
@@ -3448,8 +4181,17 @@
                 <w:b/>
                 <w:bCs/>
               </w:rPr>
-              <w:t>Order / OrderItem</w:t>
+              <w:t xml:space="preserve">Order / </w:t>
             </w:r>
+            <w:proofErr w:type="spellStart"/>
+            <w:r>
+              <w:rPr>
+                <w:b/>
+                <w:bCs/>
+              </w:rPr>
+              <w:t>OrderItem</w:t>
+            </w:r>
+            <w:proofErr w:type="spellEnd"/>
           </w:p>
         </w:tc>
         <w:tc>
@@ -3619,13 +4361,31 @@
           <w:bCs/>
         </w:rPr>
       </w:pPr>
-      <w:r>
-        <w:rPr>
-          <w:b/>
-          <w:bCs/>
-        </w:rPr>
-        <w:t>MenuCategory 1—N MenuItem</w:t>
-      </w:r>
+      <w:proofErr w:type="spellStart"/>
+      <w:r>
+        <w:rPr>
+          <w:b/>
+          <w:bCs/>
+        </w:rPr>
+        <w:t>MenuCategory</w:t>
+      </w:r>
+      <w:proofErr w:type="spellEnd"/>
+      <w:r>
+        <w:rPr>
+          <w:b/>
+          <w:bCs/>
+        </w:rPr>
+        <w:t xml:space="preserve"> 1—N </w:t>
+      </w:r>
+      <w:proofErr w:type="spellStart"/>
+      <w:r>
+        <w:rPr>
+          <w:b/>
+          <w:bCs/>
+        </w:rPr>
+        <w:t>MenuItem</w:t>
+      </w:r>
+      <w:proofErr w:type="spellEnd"/>
     </w:p>
     <w:p>
       <w:pPr>
@@ -3643,8 +4403,33 @@
           <w:b/>
           <w:bCs/>
         </w:rPr>
-        <w:t>Cart 1—N CartItem → MenuItem</w:t>
-      </w:r>
+        <w:t xml:space="preserve">Cart 1—N </w:t>
+      </w:r>
+      <w:proofErr w:type="spellStart"/>
+      <w:r>
+        <w:rPr>
+          <w:b/>
+          <w:bCs/>
+        </w:rPr>
+        <w:t>CartItem</w:t>
+      </w:r>
+      <w:proofErr w:type="spellEnd"/>
+      <w:r>
+        <w:rPr>
+          <w:b/>
+          <w:bCs/>
+        </w:rPr>
+        <w:t xml:space="preserve"> → </w:t>
+      </w:r>
+      <w:proofErr w:type="spellStart"/>
+      <w:r>
+        <w:rPr>
+          <w:b/>
+          <w:bCs/>
+        </w:rPr>
+        <w:t>MenuItem</w:t>
+      </w:r>
+      <w:proofErr w:type="spellEnd"/>
     </w:p>
     <w:p>
       <w:pPr>
@@ -3662,8 +4447,34 @@
           <w:b/>
           <w:bCs/>
         </w:rPr>
-        <w:t>Order 1—N OrderItem → MenuItem</w:t>
-      </w:r>
+        <w:lastRenderedPageBreak/>
+        <w:t xml:space="preserve">Order 1—N </w:t>
+      </w:r>
+      <w:proofErr w:type="spellStart"/>
+      <w:r>
+        <w:rPr>
+          <w:b/>
+          <w:bCs/>
+        </w:rPr>
+        <w:t>OrderItem</w:t>
+      </w:r>
+      <w:proofErr w:type="spellEnd"/>
+      <w:r>
+        <w:rPr>
+          <w:b/>
+          <w:bCs/>
+        </w:rPr>
+        <w:t xml:space="preserve"> → </w:t>
+      </w:r>
+      <w:proofErr w:type="spellStart"/>
+      <w:r>
+        <w:rPr>
+          <w:b/>
+          <w:bCs/>
+        </w:rPr>
+        <w:t>MenuItem</w:t>
+      </w:r>
+      <w:proofErr w:type="spellEnd"/>
     </w:p>
     <w:p>
       <w:pPr>
@@ -4006,13 +4817,31 @@
                 <w:bCs/>
               </w:rPr>
             </w:pPr>
+            <w:proofErr w:type="spellStart"/>
             <w:r>
               <w:rPr>
                 <w:b/>
                 <w:bCs/>
               </w:rPr>
-              <w:t>MenuItem, MenuCategory</w:t>
+              <w:t>MenuItem</w:t>
             </w:r>
+            <w:proofErr w:type="spellEnd"/>
+            <w:r>
+              <w:rPr>
+                <w:b/>
+                <w:bCs/>
+              </w:rPr>
+              <w:t xml:space="preserve">, </w:t>
+            </w:r>
+            <w:proofErr w:type="spellStart"/>
+            <w:r>
+              <w:rPr>
+                <w:b/>
+                <w:bCs/>
+              </w:rPr>
+              <w:t>MenuCategory</w:t>
+            </w:r>
+            <w:proofErr w:type="spellEnd"/>
           </w:p>
         </w:tc>
       </w:tr>
@@ -4197,8 +5026,33 @@
                 <w:b/>
                 <w:bCs/>
               </w:rPr>
-              <w:t>Cart, CartItem, Order, OrderItem</w:t>
+              <w:t xml:space="preserve">Cart, </w:t>
             </w:r>
+            <w:proofErr w:type="spellStart"/>
+            <w:r>
+              <w:rPr>
+                <w:b/>
+                <w:bCs/>
+              </w:rPr>
+              <w:t>CartItem</w:t>
+            </w:r>
+            <w:proofErr w:type="spellEnd"/>
+            <w:r>
+              <w:rPr>
+                <w:b/>
+                <w:bCs/>
+              </w:rPr>
+              <w:t xml:space="preserve">, Order, </w:t>
+            </w:r>
+            <w:proofErr w:type="spellStart"/>
+            <w:r>
+              <w:rPr>
+                <w:b/>
+                <w:bCs/>
+              </w:rPr>
+              <w:t>OrderItem</w:t>
+            </w:r>
+            <w:proofErr w:type="spellEnd"/>
           </w:p>
         </w:tc>
       </w:tr>
@@ -4454,7 +5308,6 @@
           <w:b/>
           <w:bCs/>
         </w:rPr>
-        <w:lastRenderedPageBreak/>
         <w:t>JWT authentication and role-based authorization are enforced across all protected endpoints.</w:t>
       </w:r>
     </w:p>
@@ -4749,6 +5602,7 @@
                 <w:bCs/>
               </w:rPr>
             </w:pPr>
+            <w:proofErr w:type="spellStart"/>
             <w:r>
               <w:rPr>
                 <w:b/>
@@ -4756,6 +5610,7 @@
               </w:rPr>
               <w:t>BCrypt</w:t>
             </w:r>
+            <w:proofErr w:type="spellEnd"/>
           </w:p>
         </w:tc>
         <w:tc>
@@ -4847,13 +5702,16 @@
                 <w:bCs/>
               </w:rPr>
             </w:pPr>
+            <w:proofErr w:type="spellStart"/>
             <w:r>
               <w:rPr>
                 <w:b/>
                 <w:bCs/>
               </w:rPr>
+              <w:lastRenderedPageBreak/>
               <w:t>MoSCoW</w:t>
             </w:r>
+            <w:proofErr w:type="spellEnd"/>
           </w:p>
         </w:tc>
         <w:tc>
@@ -7576,6 +8434,155 @@
     </w:lvl>
   </w:abstractNum>
   <w:abstractNum w:abstractNumId="18" w15:restartNumberingAfterBreak="0">
+    <w:nsid w:val="382A7024"/>
+    <w:multiLevelType w:val="multilevel"/>
+    <w:tmpl w:val="E138BC48"/>
+    <w:lvl w:ilvl="0">
+      <w:start w:val="1"/>
+      <w:numFmt w:val="bullet"/>
+      <w:lvlText w:val=""/>
+      <w:lvlJc w:val="left"/>
+      <w:pPr>
+        <w:tabs>
+          <w:tab w:val="num" w:pos="720"/>
+        </w:tabs>
+        <w:ind w:left="720" w:hanging="360"/>
+      </w:pPr>
+      <w:rPr>
+        <w:rFonts w:ascii="Symbol" w:hAnsi="Symbol" w:hint="default"/>
+        <w:sz w:val="20"/>
+      </w:rPr>
+    </w:lvl>
+    <w:lvl w:ilvl="1" w:tentative="1">
+      <w:start w:val="1"/>
+      <w:numFmt w:val="bullet"/>
+      <w:lvlText w:val="o"/>
+      <w:lvlJc w:val="left"/>
+      <w:pPr>
+        <w:tabs>
+          <w:tab w:val="num" w:pos="1440"/>
+        </w:tabs>
+        <w:ind w:left="1440" w:hanging="360"/>
+      </w:pPr>
+      <w:rPr>
+        <w:rFonts w:ascii="Courier New" w:hAnsi="Courier New" w:hint="default"/>
+        <w:sz w:val="20"/>
+      </w:rPr>
+    </w:lvl>
+    <w:lvl w:ilvl="2" w:tentative="1">
+      <w:start w:val="1"/>
+      <w:numFmt w:val="bullet"/>
+      <w:lvlText w:val=""/>
+      <w:lvlJc w:val="left"/>
+      <w:pPr>
+        <w:tabs>
+          <w:tab w:val="num" w:pos="2160"/>
+        </w:tabs>
+        <w:ind w:left="2160" w:hanging="360"/>
+      </w:pPr>
+      <w:rPr>
+        <w:rFonts w:ascii="Wingdings" w:hAnsi="Wingdings" w:hint="default"/>
+        <w:sz w:val="20"/>
+      </w:rPr>
+    </w:lvl>
+    <w:lvl w:ilvl="3" w:tentative="1">
+      <w:start w:val="1"/>
+      <w:numFmt w:val="bullet"/>
+      <w:lvlText w:val=""/>
+      <w:lvlJc w:val="left"/>
+      <w:pPr>
+        <w:tabs>
+          <w:tab w:val="num" w:pos="2880"/>
+        </w:tabs>
+        <w:ind w:left="2880" w:hanging="360"/>
+      </w:pPr>
+      <w:rPr>
+        <w:rFonts w:ascii="Wingdings" w:hAnsi="Wingdings" w:hint="default"/>
+        <w:sz w:val="20"/>
+      </w:rPr>
+    </w:lvl>
+    <w:lvl w:ilvl="4" w:tentative="1">
+      <w:start w:val="1"/>
+      <w:numFmt w:val="bullet"/>
+      <w:lvlText w:val=""/>
+      <w:lvlJc w:val="left"/>
+      <w:pPr>
+        <w:tabs>
+          <w:tab w:val="num" w:pos="3600"/>
+        </w:tabs>
+        <w:ind w:left="3600" w:hanging="360"/>
+      </w:pPr>
+      <w:rPr>
+        <w:rFonts w:ascii="Wingdings" w:hAnsi="Wingdings" w:hint="default"/>
+        <w:sz w:val="20"/>
+      </w:rPr>
+    </w:lvl>
+    <w:lvl w:ilvl="5" w:tentative="1">
+      <w:start w:val="1"/>
+      <w:numFmt w:val="bullet"/>
+      <w:lvlText w:val=""/>
+      <w:lvlJc w:val="left"/>
+      <w:pPr>
+        <w:tabs>
+          <w:tab w:val="num" w:pos="4320"/>
+        </w:tabs>
+        <w:ind w:left="4320" w:hanging="360"/>
+      </w:pPr>
+      <w:rPr>
+        <w:rFonts w:ascii="Wingdings" w:hAnsi="Wingdings" w:hint="default"/>
+        <w:sz w:val="20"/>
+      </w:rPr>
+    </w:lvl>
+    <w:lvl w:ilvl="6" w:tentative="1">
+      <w:start w:val="1"/>
+      <w:numFmt w:val="bullet"/>
+      <w:lvlText w:val=""/>
+      <w:lvlJc w:val="left"/>
+      <w:pPr>
+        <w:tabs>
+          <w:tab w:val="num" w:pos="5040"/>
+        </w:tabs>
+        <w:ind w:left="5040" w:hanging="360"/>
+      </w:pPr>
+      <w:rPr>
+        <w:rFonts w:ascii="Wingdings" w:hAnsi="Wingdings" w:hint="default"/>
+        <w:sz w:val="20"/>
+      </w:rPr>
+    </w:lvl>
+    <w:lvl w:ilvl="7" w:tentative="1">
+      <w:start w:val="1"/>
+      <w:numFmt w:val="bullet"/>
+      <w:lvlText w:val=""/>
+      <w:lvlJc w:val="left"/>
+      <w:pPr>
+        <w:tabs>
+          <w:tab w:val="num" w:pos="5760"/>
+        </w:tabs>
+        <w:ind w:left="5760" w:hanging="360"/>
+      </w:pPr>
+      <w:rPr>
+        <w:rFonts w:ascii="Wingdings" w:hAnsi="Wingdings" w:hint="default"/>
+        <w:sz w:val="20"/>
+      </w:rPr>
+    </w:lvl>
+    <w:lvl w:ilvl="8" w:tentative="1">
+      <w:start w:val="1"/>
+      <w:numFmt w:val="bullet"/>
+      <w:lvlText w:val=""/>
+      <w:lvlJc w:val="left"/>
+      <w:pPr>
+        <w:tabs>
+          <w:tab w:val="num" w:pos="6480"/>
+        </w:tabs>
+        <w:ind w:left="6480" w:hanging="360"/>
+      </w:pPr>
+      <w:rPr>
+        <w:rFonts w:ascii="Wingdings" w:hAnsi="Wingdings" w:hint="default"/>
+        <w:sz w:val="20"/>
+      </w:rPr>
+    </w:lvl>
+  </w:abstractNum>
+  <w:abstractNum w:abstractNumId="19" w15:restartNumberingAfterBreak="0">
     <w:nsid w:val="3A7B4FA9"/>
     <w:multiLevelType w:val="multilevel"/>
     <w:tmpl w:val="852EC916"/>
@@ -7724,7 +8731,7 @@
       </w:rPr>
     </w:lvl>
   </w:abstractNum>
-  <w:abstractNum w:abstractNumId="19" w15:restartNumberingAfterBreak="0">
+  <w:abstractNum w:abstractNumId="20" w15:restartNumberingAfterBreak="0">
     <w:nsid w:val="3DED6F07"/>
     <w:multiLevelType w:val="multilevel"/>
     <w:tmpl w:val="6254C2C4"/>
@@ -7873,7 +8880,7 @@
       </w:rPr>
     </w:lvl>
   </w:abstractNum>
-  <w:abstractNum w:abstractNumId="20" w15:restartNumberingAfterBreak="0">
+  <w:abstractNum w:abstractNumId="21" w15:restartNumberingAfterBreak="0">
     <w:nsid w:val="41E3580F"/>
     <w:multiLevelType w:val="multilevel"/>
     <w:tmpl w:val="11461504"/>
@@ -8022,7 +9029,7 @@
       </w:rPr>
     </w:lvl>
   </w:abstractNum>
-  <w:abstractNum w:abstractNumId="21" w15:restartNumberingAfterBreak="0">
+  <w:abstractNum w:abstractNumId="22" w15:restartNumberingAfterBreak="0">
     <w:nsid w:val="47537D21"/>
     <w:multiLevelType w:val="multilevel"/>
     <w:tmpl w:val="7D769E72"/>
@@ -8171,7 +9178,156 @@
       </w:rPr>
     </w:lvl>
   </w:abstractNum>
-  <w:abstractNum w:abstractNumId="22" w15:restartNumberingAfterBreak="0">
+  <w:abstractNum w:abstractNumId="23" w15:restartNumberingAfterBreak="0">
+    <w:nsid w:val="48FF24B9"/>
+    <w:multiLevelType w:val="multilevel"/>
+    <w:tmpl w:val="F3CC8E12"/>
+    <w:lvl w:ilvl="0">
+      <w:start w:val="1"/>
+      <w:numFmt w:val="bullet"/>
+      <w:lvlText w:val=""/>
+      <w:lvlJc w:val="left"/>
+      <w:pPr>
+        <w:tabs>
+          <w:tab w:val="num" w:pos="720"/>
+        </w:tabs>
+        <w:ind w:left="720" w:hanging="360"/>
+      </w:pPr>
+      <w:rPr>
+        <w:rFonts w:ascii="Symbol" w:hAnsi="Symbol" w:hint="default"/>
+        <w:sz w:val="20"/>
+      </w:rPr>
+    </w:lvl>
+    <w:lvl w:ilvl="1" w:tentative="1">
+      <w:start w:val="1"/>
+      <w:numFmt w:val="bullet"/>
+      <w:lvlText w:val="o"/>
+      <w:lvlJc w:val="left"/>
+      <w:pPr>
+        <w:tabs>
+          <w:tab w:val="num" w:pos="1440"/>
+        </w:tabs>
+        <w:ind w:left="1440" w:hanging="360"/>
+      </w:pPr>
+      <w:rPr>
+        <w:rFonts w:ascii="Courier New" w:hAnsi="Courier New" w:hint="default"/>
+        <w:sz w:val="20"/>
+      </w:rPr>
+    </w:lvl>
+    <w:lvl w:ilvl="2" w:tentative="1">
+      <w:start w:val="1"/>
+      <w:numFmt w:val="bullet"/>
+      <w:lvlText w:val=""/>
+      <w:lvlJc w:val="left"/>
+      <w:pPr>
+        <w:tabs>
+          <w:tab w:val="num" w:pos="2160"/>
+        </w:tabs>
+        <w:ind w:left="2160" w:hanging="360"/>
+      </w:pPr>
+      <w:rPr>
+        <w:rFonts w:ascii="Wingdings" w:hAnsi="Wingdings" w:hint="default"/>
+        <w:sz w:val="20"/>
+      </w:rPr>
+    </w:lvl>
+    <w:lvl w:ilvl="3" w:tentative="1">
+      <w:start w:val="1"/>
+      <w:numFmt w:val="bullet"/>
+      <w:lvlText w:val=""/>
+      <w:lvlJc w:val="left"/>
+      <w:pPr>
+        <w:tabs>
+          <w:tab w:val="num" w:pos="2880"/>
+        </w:tabs>
+        <w:ind w:left="2880" w:hanging="360"/>
+      </w:pPr>
+      <w:rPr>
+        <w:rFonts w:ascii="Wingdings" w:hAnsi="Wingdings" w:hint="default"/>
+        <w:sz w:val="20"/>
+      </w:rPr>
+    </w:lvl>
+    <w:lvl w:ilvl="4" w:tentative="1">
+      <w:start w:val="1"/>
+      <w:numFmt w:val="bullet"/>
+      <w:lvlText w:val=""/>
+      <w:lvlJc w:val="left"/>
+      <w:pPr>
+        <w:tabs>
+          <w:tab w:val="num" w:pos="3600"/>
+        </w:tabs>
+        <w:ind w:left="3600" w:hanging="360"/>
+      </w:pPr>
+      <w:rPr>
+        <w:rFonts w:ascii="Wingdings" w:hAnsi="Wingdings" w:hint="default"/>
+        <w:sz w:val="20"/>
+      </w:rPr>
+    </w:lvl>
+    <w:lvl w:ilvl="5" w:tentative="1">
+      <w:start w:val="1"/>
+      <w:numFmt w:val="bullet"/>
+      <w:lvlText w:val=""/>
+      <w:lvlJc w:val="left"/>
+      <w:pPr>
+        <w:tabs>
+          <w:tab w:val="num" w:pos="4320"/>
+        </w:tabs>
+        <w:ind w:left="4320" w:hanging="360"/>
+      </w:pPr>
+      <w:rPr>
+        <w:rFonts w:ascii="Wingdings" w:hAnsi="Wingdings" w:hint="default"/>
+        <w:sz w:val="20"/>
+      </w:rPr>
+    </w:lvl>
+    <w:lvl w:ilvl="6" w:tentative="1">
+      <w:start w:val="1"/>
+      <w:numFmt w:val="bullet"/>
+      <w:lvlText w:val=""/>
+      <w:lvlJc w:val="left"/>
+      <w:pPr>
+        <w:tabs>
+          <w:tab w:val="num" w:pos="5040"/>
+        </w:tabs>
+        <w:ind w:left="5040" w:hanging="360"/>
+      </w:pPr>
+      <w:rPr>
+        <w:rFonts w:ascii="Wingdings" w:hAnsi="Wingdings" w:hint="default"/>
+        <w:sz w:val="20"/>
+      </w:rPr>
+    </w:lvl>
+    <w:lvl w:ilvl="7" w:tentative="1">
+      <w:start w:val="1"/>
+      <w:numFmt w:val="bullet"/>
+      <w:lvlText w:val=""/>
+      <w:lvlJc w:val="left"/>
+      <w:pPr>
+        <w:tabs>
+          <w:tab w:val="num" w:pos="5760"/>
+        </w:tabs>
+        <w:ind w:left="5760" w:hanging="360"/>
+      </w:pPr>
+      <w:rPr>
+        <w:rFonts w:ascii="Wingdings" w:hAnsi="Wingdings" w:hint="default"/>
+        <w:sz w:val="20"/>
+      </w:rPr>
+    </w:lvl>
+    <w:lvl w:ilvl="8" w:tentative="1">
+      <w:start w:val="1"/>
+      <w:numFmt w:val="bullet"/>
+      <w:lvlText w:val=""/>
+      <w:lvlJc w:val="left"/>
+      <w:pPr>
+        <w:tabs>
+          <w:tab w:val="num" w:pos="6480"/>
+        </w:tabs>
+        <w:ind w:left="6480" w:hanging="360"/>
+      </w:pPr>
+      <w:rPr>
+        <w:rFonts w:ascii="Wingdings" w:hAnsi="Wingdings" w:hint="default"/>
+        <w:sz w:val="20"/>
+      </w:rPr>
+    </w:lvl>
+  </w:abstractNum>
+  <w:abstractNum w:abstractNumId="24" w15:restartNumberingAfterBreak="0">
     <w:nsid w:val="4DF90DD1"/>
     <w:multiLevelType w:val="multilevel"/>
     <w:tmpl w:val="6AD29B40"/>
@@ -8320,7 +9476,7 @@
       </w:rPr>
     </w:lvl>
   </w:abstractNum>
-  <w:abstractNum w:abstractNumId="23" w15:restartNumberingAfterBreak="0">
+  <w:abstractNum w:abstractNumId="25" w15:restartNumberingAfterBreak="0">
     <w:nsid w:val="70151ACE"/>
     <w:multiLevelType w:val="multilevel"/>
     <w:tmpl w:val="2D2AF20A"/>
@@ -8469,7 +9625,7 @@
       </w:rPr>
     </w:lvl>
   </w:abstractNum>
-  <w:abstractNum w:abstractNumId="24" w15:restartNumberingAfterBreak="0">
+  <w:abstractNum w:abstractNumId="26" w15:restartNumberingAfterBreak="0">
     <w:nsid w:val="73FE322A"/>
     <w:multiLevelType w:val="multilevel"/>
     <w:tmpl w:val="702E0E76"/>
@@ -8646,13 +9802,13 @@
     <w:abstractNumId w:val="10"/>
   </w:num>
   <w:num w:numId="10" w16cid:durableId="2112973661">
-    <w:abstractNumId w:val="23"/>
+    <w:abstractNumId w:val="25"/>
   </w:num>
   <w:num w:numId="11" w16cid:durableId="1476877863">
     <w:abstractNumId w:val="6"/>
   </w:num>
   <w:num w:numId="12" w16cid:durableId="1580016316">
-    <w:abstractNumId w:val="20"/>
+    <w:abstractNumId w:val="21"/>
   </w:num>
   <w:num w:numId="13" w16cid:durableId="2065136492">
     <w:abstractNumId w:val="14"/>
@@ -8661,7 +9817,7 @@
     <w:abstractNumId w:val="13"/>
   </w:num>
   <w:num w:numId="15" w16cid:durableId="636566965">
-    <w:abstractNumId w:val="24"/>
+    <w:abstractNumId w:val="26"/>
   </w:num>
   <w:num w:numId="16" w16cid:durableId="2042170869">
     <w:abstractNumId w:val="0"/>
@@ -8673,16 +9829,16 @@
     <w:abstractNumId w:val="1"/>
   </w:num>
   <w:num w:numId="19" w16cid:durableId="753625322">
-    <w:abstractNumId w:val="22"/>
+    <w:abstractNumId w:val="24"/>
   </w:num>
   <w:num w:numId="20" w16cid:durableId="1082918947">
     <w:abstractNumId w:val="15"/>
   </w:num>
   <w:num w:numId="21" w16cid:durableId="1894922014">
-    <w:abstractNumId w:val="21"/>
+    <w:abstractNumId w:val="22"/>
   </w:num>
   <w:num w:numId="22" w16cid:durableId="1020081869">
-    <w:abstractNumId w:val="19"/>
+    <w:abstractNumId w:val="20"/>
   </w:num>
   <w:num w:numId="23" w16cid:durableId="1784108617">
     <w:abstractNumId w:val="5"/>
@@ -8691,6 +9847,12 @@
     <w:abstractNumId w:val="3"/>
   </w:num>
   <w:num w:numId="25" w16cid:durableId="1660497262">
+    <w:abstractNumId w:val="19"/>
+  </w:num>
+  <w:num w:numId="26" w16cid:durableId="1972396950">
+    <w:abstractNumId w:val="23"/>
+  </w:num>
+  <w:num w:numId="27" w16cid:durableId="1662926563">
     <w:abstractNumId w:val="18"/>
   </w:num>
   <w:numIdMacAtCleanup w:val="25"/>
@@ -9300,7 +10462,6 @@
   <w:style w:type="character" w:default="1" w:styleId="DefaultParagraphFont">
     <w:name w:val="Default Paragraph Font"/>
     <w:uiPriority w:val="1"/>
-    <w:semiHidden/>
     <w:unhideWhenUsed/>
   </w:style>
   <w:style w:type="table" w:default="1" w:styleId="TableNormal">

</xml_diff>